<commit_message>
Update PRFAQ Draft 4
</commit_message>
<xml_diff>
--- a/CPFR_VDS_CPH_Docs/TPM/CPFR_PRFAQ_Draft4.docx
+++ b/CPFR_VDS_CPH_Docs/TPM/CPFR_PRFAQ_Draft4.docx
@@ -32,7 +32,7 @@
         <w:t xml:space="preserve">Last Updated: </w:t>
       </w:r>
       <w:r>
-        <w:t xml:space="preserve">2026-03-13  |  </w:t>
+        <w:t xml:space="preserve">2026-03-16  |  </w:t>
       </w:r>
       <w:r>
         <w:rPr>
@@ -89,7 +89,7 @@
           <w:i/>
           <w:iCs/>
         </w:rPr>
-        <w:t xml:space="preserve">The data foundation for 3,200+ vendor relationships moves from fragmented manual processes to daily self-service—closing a competitive gap with major retailers, eliminating scaling bottlenecks, and giving vendors structured visibility into compliance and chargeback data for the first time.</w:t>
+        <w:t xml:space="preserve">The data foundation for 3,200+ vendor relationships moves from weekly email and manual processes to daily self-service—closing a competitive gap with major retailers and eliminating scaling bottlenecks.</w:t>
       </w:r>
     </w:p>
     <w:p>
@@ -117,31 +117,23 @@
         <w:spacing w:after="120"/>
       </w:pPr>
       <w:r>
-        <w:t xml:space="preserve">CPFR is the shared data foundation for Chewy’s vendor collaboration model. It provides the forecast, inventory, and replenishment data that In-Stock Managers and vendors reference for order planning, performance monitoring, and joint business alignment—spanning the majority of vendor-facing work across Chewy’s supply chain organization. The program currently serves more than 3,200 vendors with line-of-sight to 4,150+. The Vendor Compliance module provides vendors with structured, self-service access to chargeback and violation data—replacing a fragmented process that generated approximately 1,500 Oracle CRM dispute tickets annually across multiple teams.</w:t>
-      </w:r>
-    </w:p>
-    <w:p>
-      <w:pPr>
-        <w:spacing w:after="120"/>
-      </w:pPr>
-      <w:r>
-        <w:t xml:space="preserve">Together, the platform and portal enhancements announced today are projected to unlock a combined annual entitlement opportunity of approximately $10–12M, including chargeback expansion (~$10M), ISM capacity reallocation (~$600K), vendor enablement (~$712K), and data governance efficiency (~$375K). Major retail competitors, including Amazon and Walmart, already provide equivalent portal-based data access to their vendor partners.</w:t>
-      </w:r>
-    </w:p>
-    <w:p>
-      <w:pPr>
-        <w:spacing w:after="120"/>
-      </w:pPr>
-      <w:r>
-        <w:t xml:space="preserve">Until today, CPFR distributed data through weekly emailed reports—a model designed when the program served roughly 1,000 vendors. At more than three times that scale, the manual process had created compounding strain: distribution list management required dedicated contractor triage to handle inbound vendor requests before they reached the CPFR team; data freshness was limited to weekly snapshots while vendors and ISMs needed mid-week visibility for responsive decision-making; and Chewy remained the sole handler of vendor-to-recipient mapping, creating exposure to misdirected proprietary data—a risk that had materialized and whose blast radius grew with every vendor added. In parallel, vendors receiving CPFR data through email and premium data through VDS had identified discrepancies between the two systems, requiring cross-team triage that consumed 4–6 people across departments for one to two days per incident. Vendor Compliance data followed a similarly fragmented path, with chargeback disputes generating substantial manual workload with no vendor-side self-service capability.</w:t>
-      </w:r>
-    </w:p>
-    <w:p>
-      <w:pPr>
-        <w:spacing w:after="120"/>
-      </w:pPr>
-      <w:r>
-        <w:t xml:space="preserve">The integration in Chewy Partner Hub addresses these constraints through complementary components. A governed data platform built in Snowflake by SC-BIE establishes a single source of truth with daily refresh, vendor isolation, immutable snapshots, and data lineage, eliminating the class of cross-system discrepancies entirely. The CPFR module in CPH provides vendors with on-demand access to current and historical data through a secure portal, self-service administration of distribution lists, and a scorecard landing page for at-a-glance business performance—removing Chewy as the manual bottleneck. The Vendor Compliance module enables vendor self-service for chargeback dispute resolution and integrates compliance metrics into ISM discussion frameworks, reducing manual ticket volume and giving vendors structured accountability data they can act on directly.</w:t>
+        <w:t xml:space="preserve">CPFR is the shared data foundation for Chewy’s vendor collaboration model, providing the forecast, inventory, and replenishment data that In-Stock Managers and vendors reference daily for order planning, performance monitoring, and joint business alignment across more than 3,200 vendor relationships. The Vendor Compliance module provides vendors with structured, self-service access to chargeback and violation data—replacing a fragmented, ticket-driven process. Major retail competitors, including Amazon and Walmart, already provide equivalent portal-based data access to their vendor partners.</w:t>
+      </w:r>
+    </w:p>
+    <w:p>
+      <w:pPr>
+        <w:spacing w:after="120"/>
+      </w:pPr>
+      <w:r>
+        <w:t xml:space="preserve">Until now, CPFR has distributed this data through weekly emailed reports—a model designed when the program served roughly 1,000 vendors. At more than three times that scale, the manual process created compounding strain: data freshness was limited to weekly snapshots while vendors and ISMs needed mid-week visibility for responsive decision-making; vendors had no self-service access to current or historical data between report cycles; and all changes to distribution lists required manual coordination through Chewy, creating delays and administrative overhead that scaled with every vendor added. Chargeback disputes followed a similarly manual path, with no vendor-side visibility into dispute status or resolution.</w:t>
+      </w:r>
+    </w:p>
+    <w:p>
+      <w:pPr>
+        <w:spacing w:after="120"/>
+      </w:pPr>
+      <w:r>
+        <w:t xml:space="preserve">The CPFR integration in Chewy Partner Hub addresses these constraints through two complementary components. A governed data platform built in Snowflake by SC-BIE establishes a single source of truth with daily refresh, vendor isolation, immutable snapshots, and data lineage, eliminating the class of cross-system discrepancies entirely. The CPFR module in CPH provides vendors with on-demand access to current and historical data through a secure portal, self-service administration of distribution lists, and a scorecard landing page for at-a-glance business performance—removing Chewy as the manual bottleneck and giving vendors the self-service capability they already experience with other major retail partners. The Vendor Compliance module enables self-service chargeback dispute resolution and integrates compliance metrics into vendor-facing workflows.</w:t>
       </w:r>
     </w:p>
     <w:p>
@@ -208,15 +200,15 @@
         <w:spacing w:after="120"/>
       </w:pPr>
       <w:r>
-        <w:t xml:space="preserve">CPFR provided—and continues to provide—the shared data substrate for vendor collaboration across Chewy’s In-Stock organization. ISM vendor-facing work, from order planning to performance monitoring to joint business reviews, depended on CPFR data as a primary input. When CPFR data was disrupted or unavailable, vendor escalations were immediate, routing through the CPFR team and, if unresolved, climbing into merchandising—where they became commercial relationship issues.</w:t>
-      </w:r>
-    </w:p>
-    <w:p>
-      <w:pPr>
-        <w:spacing w:after="120"/>
-      </w:pPr>
-      <w:r>
-        <w:t xml:space="preserve">Quantified value and exposure at the time of the integration decision:</w:t>
+        <w:t xml:space="preserve">CPFR provides the shared data substrate for vendor collaboration across Chewy’s In-Stock organization. ISM vendor-facing work—from order planning to performance monitoring to joint business reviews—depends on CPFR data as a primary input. When CPFR data was disrupted or unavailable, vendor escalations were immediate, routing through the CPFR team and, if unresolved, climbing into merchandising—where they became commercial relationship issues.</w:t>
+      </w:r>
+    </w:p>
+    <w:p>
+      <w:pPr>
+        <w:spacing w:after="120"/>
+      </w:pPr>
+      <w:r>
+        <w:t xml:space="preserve">Quantified value and exposure:</w:t>
       </w:r>
     </w:p>
     <w:p>
@@ -242,7 +234,7 @@
         <w:spacing w:after="80"/>
       </w:pPr>
       <w:r>
-        <w:t xml:space="preserve">$5M documented cost avoidance from a single forecast threshold mismatch event; ~$15M estimated annual exposure from recurring threshold issues (detailed incident documentation on file)</w:t>
+        <w:t xml:space="preserve">$5M documented cost avoidance from a single forecast threshold mismatch event; ~$15M estimated annual exposure from recurring threshold issues</w:t>
       </w:r>
     </w:p>
     <w:p>
@@ -255,7 +247,7 @@
         <w:spacing w:after="80"/>
       </w:pPr>
       <w:r>
-        <w:t xml:space="preserve">~$10M in chargeback expansion entitlement through structured vendor self-service and expanded chargeback categories</w:t>
+        <w:t xml:space="preserve">~$10M in chargeback expansion entitlement through structured vendor self-service and expanded chargeback categories; ~1,500 Oracle CRM dispute tickets annually consumed operational capacity across multiple teams</w:t>
       </w:r>
     </w:p>
     <w:p>
@@ -286,6 +278,215 @@
     </w:p>
     <w:p>
       <w:pPr>
+        <w:spacing w:after="60"/>
+      </w:pPr>
+    </w:p>
+    <w:p>
+      <w:pPr>
+        <w:spacing w:after="120"/>
+      </w:pPr>
+      <w:r>
+        <w:t xml:space="preserve">In January 2026, proprietary inventory and forecast data for Kent Nutrition Group was released to an unrelated vendor due to erroneous distribution list information—contained without further exposure, but illustrating a systemic vulnerability in manual distribution list management that scaled with vendor count.</w:t>
+      </w:r>
+    </w:p>
+    <w:p>
+      <w:pPr>
+        <w:spacing w:after="120"/>
+      </w:pPr>
+      <w:r>
+        <w:t xml:space="preserve">The prior operating model—manual email distribution, Chewy-managed recipient lists, weekly data cadence, parallel query architectures across CPFR and VDS, and ticket-driven chargeback disputes—was viable at 1,000 vendors. At 3,200+ and growing, it created compounding risk across data integrity, operational capacity, and vendor trust.</w:t>
+      </w:r>
+    </w:p>
+    <w:p>
+      <w:pPr>
+        <w:spacing w:after="60"/>
+      </w:pPr>
+    </w:p>
+    <w:p>
+      <w:pPr>
+        <w:spacing w:after="120"/>
+      </w:pPr>
+      <w:r>
+        <w:rPr>
+          <w:b/>
+          <w:bCs/>
+        </w:rPr>
+        <w:t xml:space="preserve">Q: This initiative was submitted for OP1 funding and was deprioritized. How was the investment decision ultimately made?</w:t>
+      </w:r>
+    </w:p>
+    <w:p>
+      <w:pPr>
+        <w:spacing w:after="60"/>
+      </w:pPr>
+    </w:p>
+    <w:p>
+      <w:pPr>
+        <w:spacing w:after="120"/>
+      </w:pPr>
+      <w:r>
+        <w:t xml:space="preserve">The OP1 submission was deprioritized due to competing initiatives and late insertion into the planning cycle—not rejected on the merits of its business case. Since that submission, the most capital-intensive component—the CPFR data platform—continued to deliver on schedule (March 31, 2026). The remaining work was portal integration in CPH: connecting a completed data platform to the vendor-facing experience.</w:t>
+      </w:r>
+    </w:p>
+    <w:p>
+      <w:pPr>
+        <w:spacing w:after="120"/>
+      </w:pPr>
+      <w:r>
+        <w:t xml:space="preserve">The cost-benefit asymmetry was stark. The marginal investment to realize value on a platform already built was bounded to CPH engineering capacity—while the value at risk included $1.4M in projected recurring annual cost avoidance, $15M in annual exposure from recurring threshold issues, and competitive parity with Amazon and Walmart, who already provided equivalent vendor portal access. Progress through allocation de-risked the funding submission by demonstrating delivery momentum and reducing remaining scope to a well-defined increment.</w:t>
+      </w:r>
+    </w:p>
+    <w:p>
+      <w:pPr>
+        <w:spacing w:after="60"/>
+      </w:pPr>
+    </w:p>
+    <w:p>
+      <w:pPr>
+        <w:spacing w:after="120"/>
+      </w:pPr>
+      <w:r>
+        <w:rPr>
+          <w:b/>
+          <w:bCs/>
+        </w:rPr>
+        <w:t xml:space="preserve">Q: How does the CPFR module maintain a unified vendor experience in CPH?</w:t>
+      </w:r>
+    </w:p>
+    <w:p>
+      <w:pPr>
+        <w:spacing w:after="60"/>
+      </w:pPr>
+    </w:p>
+    <w:p>
+      <w:pPr>
+        <w:spacing w:after="120"/>
+      </w:pPr>
+      <w:r>
+        <w:t xml:space="preserve">Unified vendor experience was a first-order design constraint for this initiative, not an afterthought. The CPFR module was built within CPH’s existing architecture, using the same navigation patterns, design language, and vendor-authentication framework that underpin all CPH capabilities. Vendor isolation, admin controls, and data governance are enforced at the platform level—not implemented per module. The CPFR and Vendor Compliance workstreams shared a consolidated BRD and were coordinated through a unified integration plan specifically to prevent the fragmentation that erodes vendor trust when modules feel disconnected. As additional capabilities come online, they inherit this shared foundation.</w:t>
+      </w:r>
+    </w:p>
+    <w:p>
+      <w:pPr>
+        <w:spacing w:after="60"/>
+      </w:pPr>
+    </w:p>
+    <w:p>
+      <w:pPr>
+        <w:spacing w:after="120"/>
+      </w:pPr>
+      <w:r>
+        <w:rPr>
+          <w:b/>
+          <w:bCs/>
+        </w:rPr>
+        <w:t xml:space="preserve">Q: How is the CPFR module in CPH different from what vendors receive through VDS?</w:t>
+      </w:r>
+    </w:p>
+    <w:p>
+      <w:pPr>
+        <w:spacing w:after="60"/>
+      </w:pPr>
+    </w:p>
+    <w:p>
+      <w:pPr>
+        <w:spacing w:after="120"/>
+      </w:pPr>
+      <w:r>
+        <w:t xml:space="preserve">VDS is a premium analytics service providing broad supply chain intelligence to 65 strategic vendors ($400K entry + 3% of COGS, plus $250K for API access). CPFR provides a narrower dataset—forecast, inventory, and replenishment data—at no cost to all 3,200+ enrolled vendors. The two serve fundamentally different needs and populations. The CPFR module in CPH does not replicate VDS; it provides self-service access to the tactical planning data that the vast majority of vendors depend on daily. Critically, both systems draw from the same governed semantic data layer, eliminating the cross-system discrepancies that had required multi-day triage when strategic vendors cross-referenced the two.</w:t>
+      </w:r>
+    </w:p>
+    <w:p>
+      <w:pPr>
+        <w:spacing w:after="60"/>
+      </w:pPr>
+    </w:p>
+    <w:p>
+      <w:pPr>
+        <w:spacing w:after="120"/>
+      </w:pPr>
+      <w:r>
+        <w:rPr>
+          <w:b/>
+          <w:bCs/>
+        </w:rPr>
+        <w:t xml:space="preserve">Q: What was the data exposure risk in the prior model, and how does the portal address it?</w:t>
+      </w:r>
+    </w:p>
+    <w:p>
+      <w:pPr>
+        <w:spacing w:after="60"/>
+      </w:pPr>
+    </w:p>
+    <w:p>
+      <w:pPr>
+        <w:spacing w:after="120"/>
+      </w:pPr>
+      <w:r>
+        <w:t xml:space="preserve">Under the prior model, Chewy was the sole handler of vendor distribution lists for CPFR. Every add, delete, or revision to which recipients received which vendor’s proprietary data was a manual process handled by the CPFR team. At 3,200+ vendors, this created persistent exposure to misdirected data. In January 2026, inventory and forecast data for Kent Nutrition Group was released to an unrelated vendor due to erroneous upload information provided through the intake process. The incident was contained without further exposure, but the mechanism that allowed it—manual vendor-to-recipient mapping with no vendor-side verification—remained in place for every vendor in the program. The portal addresses this structurally: vendor-managed self-service distribution administration means vendors control their own recipient lists directly, with changes auditable and immediate. Chewy is no longer in the chain of custody for routine distribution management, eliminating the manual error vector.</w:t>
+      </w:r>
+    </w:p>
+    <w:p>
+      <w:pPr>
+        <w:spacing w:after="60"/>
+      </w:pPr>
+    </w:p>
+    <w:p>
+      <w:pPr>
+        <w:spacing w:after="120"/>
+      </w:pPr>
+      <w:r>
+        <w:rPr>
+          <w:b/>
+          <w:bCs/>
+        </w:rPr>
+        <w:t xml:space="preserve">Q: What does the Vendor Compliance module provide that vendors did not have before?</w:t>
+      </w:r>
+    </w:p>
+    <w:p>
+      <w:pPr>
+        <w:spacing w:after="60"/>
+      </w:pPr>
+    </w:p>
+    <w:p>
+      <w:pPr>
+        <w:spacing w:after="120"/>
+      </w:pPr>
+      <w:r>
+        <w:t xml:space="preserve">Before the CPH integration, chargeback disputes were handled entirely through Oracle CRM tickets—approximately 1,500 annually—with no vendor-side visibility into dispute status, resolution criteria, or compliance history. The Vendor Compliance module provides vendors with structured, self-service access to chargeback data, dispute resolution workflows, and compliance metrics. This reduces manual ticket volume, gives vendors accountability data they can act on proactively, and integrates compliance visibility into ISM discussion frameworks. The chargeback expansion enabled through the platform represents approximately $10M in annual entitlement opportunity.</w:t>
+      </w:r>
+    </w:p>
+    <w:p>
+      <w:pPr>
+        <w:spacing w:after="60"/>
+      </w:pPr>
+    </w:p>
+    <w:p>
+      <w:pPr>
+        <w:spacing w:after="120"/>
+      </w:pPr>
+      <w:r>
+        <w:rPr>
+          <w:b/>
+          <w:bCs/>
+        </w:rPr>
+        <w:t xml:space="preserve">Q: What does success look like at 30/60/90 days and 12 months?</w:t>
+      </w:r>
+    </w:p>
+    <w:p>
+      <w:pPr>
+        <w:spacing w:after="60"/>
+      </w:pPr>
+    </w:p>
+    <w:p>
+      <w:pPr>
+        <w:spacing w:after="120"/>
+      </w:pPr>
+      <w:r>
+        <w:t xml:space="preserve">Success is measured through adoption and deflection metrics tied to the operational pain the integration addressed:</w:t>
+      </w:r>
+    </w:p>
+    <w:p>
+      <w:pPr>
         <w:pStyle w:val="ListParagraph"/>
         <w:numPr>
           <w:ilvl w:val="0"/>
@@ -294,216 +495,14 @@
         <w:spacing w:after="80"/>
       </w:pPr>
       <w:r>
-        <w:t xml:space="preserve">Approximately 1,500 Oracle CRM chargeback dispute tickets annually, consuming operational capacity across multiple teams with no vendor self-service path</w:t>
-      </w:r>
-    </w:p>
-    <w:p>
-      <w:pPr>
-        <w:spacing w:after="60"/>
-      </w:pPr>
-    </w:p>
-    <w:p>
-      <w:pPr>
-        <w:spacing w:after="120"/>
-      </w:pPr>
-      <w:r>
-        <w:t xml:space="preserve">In January 2026, proprietary inventory and forecast data for Kent Nutrition Group was released to an unrelated vendor due to erroneous distribution list information—contained without further exposure, but illustrating the systemic vulnerability in manual distribution list management that scaled with vendor count.</w:t>
-      </w:r>
-    </w:p>
-    <w:p>
-      <w:pPr>
-        <w:spacing w:after="120"/>
-      </w:pPr>
-      <w:r>
-        <w:t xml:space="preserve">The prior operating model—manual email distribution, Chewy-managed recipient lists, weekly data cadence, parallel query architectures across CPFR and VDS, and ticket-driven chargeback disputes—was viable at 1,000 vendors. At 3,200+ and growing, it created compounding risk across data integrity, operational capacity, and vendor trust.</w:t>
-      </w:r>
-    </w:p>
-    <w:p>
-      <w:pPr>
-        <w:spacing w:after="60"/>
-      </w:pPr>
-    </w:p>
-    <w:p>
-      <w:pPr>
-        <w:spacing w:after="120"/>
-      </w:pPr>
-      <w:r>
-        <w:rPr>
-          <w:b/>
-          <w:bCs/>
-        </w:rPr>
-        <w:t xml:space="preserve">Q: This initiative was initially submitted for OP1 funding and was deprioritized. How was the investment decision ultimately made?</w:t>
-      </w:r>
-    </w:p>
-    <w:p>
-      <w:pPr>
-        <w:spacing w:after="60"/>
-      </w:pPr>
-    </w:p>
-    <w:p>
-      <w:pPr>
-        <w:spacing w:after="120"/>
-      </w:pPr>
-      <w:r>
-        <w:t xml:space="preserve">The OP1 submission was deprioritized due to competing initiatives and late insertion into the planning cycle—not rejected on the merits of its business case. Rather than stalling, the team continued progress on allocation. The most capital-intensive component—the CPFR data platform—delivered on schedule (March 31, 2026). The VC workstream secured an engineering bridge for its SPARK-related data pipeline needs. Business requirements, user stories, wireframes, and a feasibility analysis were completed.</w:t>
-      </w:r>
-    </w:p>
-    <w:p>
-      <w:pPr>
-        <w:spacing w:after="120"/>
-      </w:pPr>
-      <w:r>
-        <w:t xml:space="preserve">The cost-benefit asymmetry was stark. The marginal investment to realize value on a platform already built was bounded to CPH engineering capacity—while the value at risk included ~$1.4M in projected CPFR-specific recurring annual cost avoidance, ~$10M in chargeback expansion entitlement, $15M in annual exposure from recurring threshold issues, and competitive parity with Amazon and Walmart, who already provided equivalent vendor portal access. Allocation-phase progress demonstrated delivery momentum and reduced remaining scope to a well-defined increment, which strengthened the case for committed funding.</w:t>
-      </w:r>
-    </w:p>
-    <w:p>
-      <w:pPr>
-        <w:spacing w:after="60"/>
-      </w:pPr>
-    </w:p>
-    <w:p>
-      <w:pPr>
-        <w:spacing w:after="120"/>
-      </w:pPr>
-      <w:r>
-        <w:rPr>
-          <w:b/>
-          <w:bCs/>
-        </w:rPr>
-        <w:t xml:space="preserve">Q: How does the CPFR module maintain a unified vendor experience in CPH?</w:t>
-      </w:r>
-    </w:p>
-    <w:p>
-      <w:pPr>
-        <w:spacing w:after="60"/>
-      </w:pPr>
-    </w:p>
-    <w:p>
-      <w:pPr>
-        <w:spacing w:after="120"/>
-      </w:pPr>
-      <w:r>
-        <w:t xml:space="preserve">Unified vendor experience was a first-order design constraint for this initiative, not an afterthought. The CPFR module was built within CPH’s existing architecture, using the same navigation patterns, design language, and vendor-authentication framework that underpin all CPH capabilities. Vendor isolation, admin controls, and data governance are enforced at the platform level—not implemented per module. The CPFR and Vendor Compliance workstreams shared a consolidated BRD and were coordinated through a unified integration plan specifically to prevent the fragmentation that erodes vendor trust when modules feel disconnected. As additional capabilities come online, they inherit this shared foundation.</w:t>
-      </w:r>
-    </w:p>
-    <w:p>
-      <w:pPr>
-        <w:spacing w:after="60"/>
-      </w:pPr>
-    </w:p>
-    <w:p>
-      <w:pPr>
-        <w:spacing w:after="120"/>
-      </w:pPr>
-      <w:r>
-        <w:rPr>
-          <w:b/>
-          <w:bCs/>
-        </w:rPr>
-        <w:t xml:space="preserve">Q: How is the CPFR module in CPH different from what vendors receive through VDS?</w:t>
-      </w:r>
-    </w:p>
-    <w:p>
-      <w:pPr>
-        <w:spacing w:after="60"/>
-      </w:pPr>
-    </w:p>
-    <w:p>
-      <w:pPr>
-        <w:spacing w:after="120"/>
-      </w:pPr>
-      <w:r>
-        <w:t xml:space="preserve">VDS is a premium analytics service providing broad supply chain intelligence to 65 strategic vendors ($400K entry + 3% of COGS, plus $250K for API access). CPFR provides a narrower dataset—forecast, inventory, and replenishment data—at no cost to all 3,200+ enrolled vendors. The two serve fundamentally different needs and populations. The CPFR module in CPH does not replicate VDS; it provides self-service access to the tactical planning data that the vast majority of vendors depend on daily. Critically, both systems draw from the same governed semantic data layer, eliminating the cross-system discrepancies that had required multi-day triage when strategic vendors cross-referenced the two.</w:t>
-      </w:r>
-    </w:p>
-    <w:p>
-      <w:pPr>
-        <w:spacing w:after="60"/>
-      </w:pPr>
-    </w:p>
-    <w:p>
-      <w:pPr>
-        <w:spacing w:after="120"/>
-      </w:pPr>
-      <w:r>
-        <w:rPr>
-          <w:b/>
-          <w:bCs/>
-        </w:rPr>
-        <w:t xml:space="preserve">Q: What was the data exposure risk in the prior model, and how does the portal address it?</w:t>
-      </w:r>
-    </w:p>
-    <w:p>
-      <w:pPr>
-        <w:spacing w:after="60"/>
-      </w:pPr>
-    </w:p>
-    <w:p>
-      <w:pPr>
-        <w:spacing w:after="120"/>
-      </w:pPr>
-      <w:r>
-        <w:t xml:space="preserve">Under the prior model, Chewy was the sole handler of vendor distribution lists for CPFR. Every add, delete, or revision to which recipients received which vendor’s proprietary data was a manual process handled by the CPFR team. At 3,200+ vendors, this created persistent exposure to misdirected data. In January 2026, inventory and forecast data for Kent Nutrition Group was released to an unrelated vendor due to erroneous upload information provided through the intake process. The incident was contained without further exposure, but the mechanism that allowed it—manual vendor-to-recipient mapping with no vendor-side verification—was in place for every vendor in the program. The portal addresses this structurally: vendor-managed self-service distribution administration means vendors control their own recipient lists directly, with changes auditable and immediate. Chewy is no longer in the chain of custody for routine distribution management, eliminating the manual error vector.</w:t>
-      </w:r>
-    </w:p>
-    <w:p>
-      <w:pPr>
-        <w:spacing w:after="60"/>
-      </w:pPr>
-    </w:p>
-    <w:p>
-      <w:pPr>
-        <w:spacing w:after="120"/>
-      </w:pPr>
-      <w:r>
-        <w:rPr>
-          <w:b/>
-          <w:bCs/>
-        </w:rPr>
-        <w:t xml:space="preserve">Q: What does the Vendor Compliance module provide that vendors didn’t have before?</w:t>
-      </w:r>
-    </w:p>
-    <w:p>
-      <w:pPr>
-        <w:spacing w:after="60"/>
-      </w:pPr>
-    </w:p>
-    <w:p>
-      <w:pPr>
-        <w:spacing w:after="120"/>
-      </w:pPr>
-      <w:r>
-        <w:t xml:space="preserve">Before the CPH integration, chargeback disputes were handled entirely through Oracle CRM tickets—approximately 1,500 annually—with no vendor-side visibility into dispute status, resolution criteria, or compliance history. The Vendor Compliance module provides vendors with structured, self-service access to chargeback data, dispute resolution workflows, and compliance metrics. This reduces manual ticket volume, gives vendors accountability data they can act on proactively, and integrates compliance visibility into ISM discussion frameworks. The chargeback expansion enabled through the platform represents approximately $10M in annual entitlement opportunity.</w:t>
-      </w:r>
-    </w:p>
-    <w:p>
-      <w:pPr>
-        <w:spacing w:after="60"/>
-      </w:pPr>
-    </w:p>
-    <w:p>
-      <w:pPr>
-        <w:spacing w:after="120"/>
-      </w:pPr>
-      <w:r>
-        <w:rPr>
-          <w:b/>
-          <w:bCs/>
-        </w:rPr>
-        <w:t xml:space="preserve">Q: What does success look like at 30/60/90 days and 12 months?</w:t>
-      </w:r>
-    </w:p>
-    <w:p>
-      <w:pPr>
-        <w:spacing w:after="60"/>
-      </w:pPr>
-    </w:p>
-    <w:p>
-      <w:pPr>
-        <w:spacing w:after="120"/>
-      </w:pPr>
-      <w:r>
-        <w:t xml:space="preserve">Success is measured through adoption and deflection metrics tied to the operational pain the integration addressed:</w:t>
+        <w:rPr>
+          <w:b/>
+          <w:bCs/>
+        </w:rPr>
+        <w:t xml:space="preserve">30 days: </w:t>
+      </w:r>
+      <w:r>
+        <w:t xml:space="preserve">Vendor activation rates by tier; report retrieval events per vendor org; percentage of vendor orgs using self-service distribution management; reduction in manual re-pull requests among onboarded vendors.</w:t>
       </w:r>
     </w:p>
     <w:p>
@@ -520,10 +519,10 @@
           <w:b/>
           <w:bCs/>
         </w:rPr>
-        <w:t xml:space="preserve">30 days: </w:t>
-      </w:r>
-      <w:r>
-        <w:t xml:space="preserve">Vendor activation rates by tier; report retrieval events per vendor org; percentage of vendor orgs using self-service distribution management; reduction in manual re-pull requests among onboarded vendors; initial chargeback self-service adoption rates.</w:t>
+        <w:t xml:space="preserve">60–90 days: </w:t>
+      </w:r>
+      <w:r>
+        <w:t xml:space="preserve">Sustained weekly active usage among revenue-weighted vendor cohort; measurable reduction in mid-week support contacts for onboarded vs. baseline vendors; reduction in Chewy-managed distribution list changes; reduction in Oracle CRM chargeback dispute tickets for onboarded vendors.</w:t>
       </w:r>
     </w:p>
     <w:p>
@@ -540,10 +539,40 @@
           <w:b/>
           <w:bCs/>
         </w:rPr>
-        <w:t xml:space="preserve">60–90 days: </w:t>
-      </w:r>
-      <w:r>
-        <w:t xml:space="preserve">Sustained weekly active usage among revenue-weighted vendor cohort; measurable reduction in mid-week support contacts for onboarded vs. baseline vendors; reduction in Chewy-managed distribution list changes; measurable reduction in Oracle CRM chargeback dispute tickets for onboarded vendors.</w:t>
+        <w:t xml:space="preserve">12 months: </w:t>
+      </w:r>
+      <w:r>
+        <w:t xml:space="preserve">Majority of CPFR-covered revenue represented by active portal usage; verified ISM capacity reclaimed via deflected request volume; chargeback dispute ticket volume materially reduced. Instrumentation via standard CPH telemetry plus tagging of CPFR and VC support contacts for onboarded vs. not-yet-onboarded cohort comparison.</w:t>
+      </w:r>
+    </w:p>
+    <w:p>
+      <w:pPr>
+        <w:spacing w:after="60"/>
+      </w:pPr>
+    </w:p>
+    <w:p>
+      <w:pPr>
+        <w:spacing w:after="120"/>
+      </w:pPr>
+      <w:r>
+        <w:rPr>
+          <w:b/>
+          <w:bCs/>
+        </w:rPr>
+        <w:t xml:space="preserve">Q: What were the primary risks, and what was the cost of inaction?</w:t>
+      </w:r>
+    </w:p>
+    <w:p>
+      <w:pPr>
+        <w:spacing w:after="60"/>
+      </w:pPr>
+    </w:p>
+    <w:p>
+      <w:pPr>
+        <w:spacing w:after="120"/>
+      </w:pPr>
+      <w:r>
+        <w:t xml:space="preserve">Primary delivery risks:</w:t>
       </w:r>
     </w:p>
     <w:p>
@@ -556,44 +585,7 @@
         <w:spacing w:after="80"/>
       </w:pPr>
       <w:r>
-        <w:rPr>
-          <w:b/>
-          <w:bCs/>
-        </w:rPr>
-        <w:t xml:space="preserve">12 months: </w:t>
-      </w:r>
-      <w:r>
-        <w:t xml:space="preserve">Majority of CPFR-covered revenue represented by active portal usage; verified ISM capacity reclaimed via deflected request volume; chargeback dispute ticket volume materially reduced. Instrumentation via standard CPH telemetry plus tagging of CPFR and VC support contacts for onboarded vs. not-yet-onboarded cohort comparison.</w:t>
-      </w:r>
-    </w:p>
-    <w:p>
-      <w:pPr>
-        <w:spacing w:after="60"/>
-      </w:pPr>
-    </w:p>
-    <w:p>
-      <w:pPr>
-        <w:spacing w:after="120"/>
-      </w:pPr>
-      <w:r>
-        <w:rPr>
-          <w:b/>
-          <w:bCs/>
-        </w:rPr>
-        <w:t xml:space="preserve">Q: What were the primary delivery risks, and how were they managed?</w:t>
-      </w:r>
-    </w:p>
-    <w:p>
-      <w:pPr>
-        <w:spacing w:after="60"/>
-      </w:pPr>
-    </w:p>
-    <w:p>
-      <w:pPr>
-        <w:spacing w:after="120"/>
-      </w:pPr>
-      <w:r>
-        <w:t xml:space="preserve">Three risks dominated the delivery path:</w:t>
+        <w:t xml:space="preserve">CPH engineering capacity remained unassigned—this was the single largest risk and was a resource decision, not a technical obstacle.</w:t>
       </w:r>
     </w:p>
     <w:p>
@@ -606,14 +598,7 @@
         <w:spacing w:after="80"/>
       </w:pPr>
       <w:r>
-        <w:rPr>
-          <w:b/>
-          <w:bCs/>
-        </w:rPr>
-        <w:t xml:space="preserve">CPH engineering capacity: </w:t>
-      </w:r>
-      <w:r>
-        <w:t xml:space="preserve">The single largest risk was securing dedicated build capacity from the CPH engineering team. This was a resource decision, not a technical obstacle. Resolution required leadership alignment and was the prerequisite for all downstream scoping and build planning.</w:t>
+        <w:t xml:space="preserve">The VC workstream risked un-stalling and consuming CPH capacity first, pushing CPFR module work further out despite the data platform being ready.</w:t>
       </w:r>
     </w:p>
     <w:p>
@@ -626,47 +611,20 @@
         <w:spacing w:after="80"/>
       </w:pPr>
       <w:r>
-        <w:rPr>
-          <w:b/>
-          <w:bCs/>
-        </w:rPr>
-        <w:t xml:space="preserve">VC/CPFR sequencing: </w:t>
-      </w:r>
-      <w:r>
-        <w:t xml:space="preserve">The original plan assumed VC would prime the CPH engineering pipeline before CPFR module work began. When the platform delivered ahead of VC’s CPH readiness, a conditional parallel track was adopted: CPFR scoping and integration planning proceeded alongside VC using primarily PM time, so that when CPH capacity became available, CPFR build began with zero ramp-up.</w:t>
-      </w:r>
-    </w:p>
-    <w:p>
-      <w:pPr>
-        <w:pStyle w:val="ListParagraph"/>
-        <w:numPr>
-          <w:ilvl w:val="0"/>
-          <w:numId w:val="2"/>
-        </w:numPr>
-        <w:spacing w:after="80"/>
-      </w:pPr>
-      <w:r>
-        <w:rPr>
-          <w:b/>
-          <w:bCs/>
-        </w:rPr>
-        <w:t xml:space="preserve">Organizational continuity: </w:t>
-      </w:r>
-      <w:r>
-        <w:t xml:space="preserve">Five successive departures dissolved every prior connective-tissue role. The initiative’s program manager stepped into the TPM function on allocation. The coordination model proved fragile but sufficient—the platform delivered on schedule and the portal integration moved forward despite the disruption.</w:t>
-      </w:r>
-    </w:p>
-    <w:p>
-      <w:pPr>
-        <w:spacing w:after="60"/>
-      </w:pPr>
-    </w:p>
-    <w:p>
-      <w:pPr>
-        <w:spacing w:after="120"/>
-      </w:pPr>
-      <w:r>
-        <w:t xml:space="preserve">The cost of inaction was clear: a completed, governed data platform sitting unconsumed while the email-based distribution process continued to scale manually toward 4,150+ vendors; data exposure risk remaining unmitigated; the competitive gap with Amazon and Walmart persisting; and the investment in business requirements, user stories, wireframes, and feasibility analysis depreciating as organizational context eroded.</w:t>
+        <w:t xml:space="preserve">Continued organizational churn eroded the institutional knowledge and cross-team relationships needed to execute—a pattern that had already removed five key contributors.</w:t>
+      </w:r>
+    </w:p>
+    <w:p>
+      <w:pPr>
+        <w:spacing w:after="60"/>
+      </w:pPr>
+    </w:p>
+    <w:p>
+      <w:pPr>
+        <w:spacing w:after="120"/>
+      </w:pPr>
+      <w:r>
+        <w:t xml:space="preserve">Had the initiative not proceeded: a completed, governed data platform would have sat unconsumed. The email-based distribution process would have continued to scale manually toward 4,150+ vendors. Data exposure risk would have remained unmitigated. The competitive gap with Amazon and Walmart would have persisted. And the investment in business requirements, user stories, wireframes, and feasibility analysis—work done specifically to de-risk the portal build—would have depreciated as organizational context eroded.</w:t>
       </w:r>
     </w:p>
     <w:p>
@@ -799,7 +757,7 @@
         <w:spacing w:after="120"/>
       </w:pPr>
       <w:r>
-        <w:t xml:space="preserve">The Vendor Compliance section of Chewy Partner Hub provides structured access to your chargeback history, dispute status, and compliance metrics. You can initiate and track disputes directly through the portal without submitting a support ticket. Your ISM or CPFR team can assist with onboarding if needed.</w:t>
+        <w:t xml:space="preserve">The Vendor Compliance section of Chewy Partner Hub provides structured access to your chargeback history, dispute status, and compliance metrics. You can initiate and track disputes directly through the portal without submitting a support ticket. Your ISM can assist with onboarding if needed.</w:t>
       </w:r>
     </w:p>
     <w:p>
@@ -829,7 +787,7 @@
         <w:spacing w:after="120"/>
       </w:pPr>
       <w:r>
-        <w:t xml:space="preserve">Access is rolled out in phases by vendor tier following the module’s launch. Your ISM or CPFR team will notify you when your organization is eligible and provide onboarding instructions. There is no cost to participate, and vendors already enrolled in CPFR do not need to re-register.</w:t>
+        <w:t xml:space="preserve">Access will be rolled out in phases by vendor tier following the module’s launch. Your ISM or CPFR team will notify you when your organization is eligible and provide onboarding instructions. There is no cost to participate, and vendors already enrolled in CPFR will not need to re-register.</w:t>
       </w:r>
     </w:p>
     <w:p>
@@ -915,7 +873,7 @@
         <w:sz w:val="16"/>
         <w:szCs w:val="16"/>
       </w:rPr>
-      <w:t xml:space="preserve">Working Draft | Last Updated: 2026-03-13 | Authors: Nathan Miles (CPFR), Nathan Nelson (VC)</w:t>
+      <w:t xml:space="preserve">Working Draft | Last Updated: 2026-03-16 | Authors: Nathan Miles (CPFR), Nathan Nelson (VC)</w:t>
     </w:r>
   </w:p>
 </w:ftr>
@@ -1091,18 +1049,6 @@
       </w:pPr>
     </w:lvl>
   </w:abstractNum>
-  <w:abstractNum w:abstractNumId="3" w15:restartNumberingAfterBreak="0">
-    <w:multiLevelType w:val="hybridMultilevel"/>
-    <w:lvl w:ilvl="0" w15:tentative="1">
-      <w:start w:val="1"/>
-      <w:numFmt w:val="decimal"/>
-      <w:lvlText w:val="%1."/>
-      <w:lvlJc w:val="left"/>
-      <w:pPr>
-        <w:ind w:left="720" w:hanging="360"/>
-      </w:pPr>
-    </w:lvl>
-  </w:abstractNum>
   <w:num w:numId="1">
     <w:abstractNumId w:val="1"/>
     <w:lvlOverride w:ilvl="0">

</xml_diff>

<commit_message>
Minor update to PRFAQ
</commit_message>
<xml_diff>
--- a/CPFR_VDS_CPH_Docs/TPM/CPFR_PRFAQ_Draft4.docx
+++ b/CPFR_VDS_CPH_Docs/TPM/CPFR_PRFAQ_Draft4.docx
@@ -72,14 +72,7 @@
           <w:b/>
           <w:bCs/>
         </w:rPr>
-        <w:t>C</w:t>
-      </w:r>
-      <w:r>
-        <w:rPr>
-          <w:b/>
-          <w:bCs/>
-        </w:rPr>
-        <w:t>hewy Modernizes Vendor Supply Chain Collaboration with CPFR and Vendor Compliance Integration in Chewy Partner Hub</w:t>
+        <w:t>Chewy Modernizes Vendor Supply Chain Collaboration with CPFR and Vendor Compliance Integration in Chewy Partner Hub</w:t>
       </w:r>
     </w:p>
     <w:p>
@@ -135,26 +128,17 @@
     </w:p>
     <w:p>
       <w:r>
-        <w:t xml:space="preserve">CPFR is the shared data foundation for Chewy’s vendor collaboration model, providing the forecast, inventory, and replenishment data that In-Stock Managers and vendors reference daily for order planning, performance monitoring, and joint business alignment across more than 3,200 vendor relationships. The Vendor Compliance module provides vendors with structured, self-service access to chargeback and violation data—replacing a fragmented, ticket-driven process. Major retail competitors, including Amazon and </w:t>
-      </w:r>
-      <w:r>
-        <w:t>Walmart, already provide equivalent portal-based data access to their vendor partners.</w:t>
-      </w:r>
-    </w:p>
-    <w:p>
-      <w:r>
-        <w:t>Until now, CPFR has distributed this data through weekly emailed reports—a model designed when the program served roughly 1,000 vendors. At more than three times that scale, the manual process created compounding strain: data freshness was limited to weekly snapshots while vendors and ISMs needed mid-week visibility for responsive decision-making; vendors had no self-service access to current or historical data between report cycles; and all changes to distribution lists required manual coordination through</w:t>
-      </w:r>
-      <w:r>
-        <w:t xml:space="preserve"> Chewy, creating delays and administrative overhead that scaled with every vendor added. Chargeback disputes followed a similarly manual path, with no vendor-side visibility into dispute status or resolution.</w:t>
-      </w:r>
-    </w:p>
-    <w:p>
-      <w:r>
-        <w:t>The CPFR integration in Chewy Partner Hub addresses these constraints through two complementary components. A governed data platform built in Snowflake by SC-BIE establishes a single source of truth with daily refresh, vendor isolation, immutable snapshots, and data lineage, eliminating the class of cross-system discrepancies entirely. The CPFR module in CPH provides vendors with on-demand access to current and historical data through a secure portal, self-service administration of distribution lists, and a</w:t>
-      </w:r>
-      <w:r>
-        <w:t xml:space="preserve"> scorecard landing page for at-a-glance business performance—removing Chewy as the manual bottleneck and giving vendors the self-service capability they already experience with other major retail partners. The Vendor Compliance module enables self-service chargeback dispute resolution and integrates compliance metrics into vendor-facing workflows.</w:t>
+        <w:t>CPFR is the shared data foundation for Chewy’s vendor collaboration model, providing the forecast, inventory, and replenishment data that In-Stock Managers and vendors reference daily for order planning, performance monitoring, and joint business alignment across more than 3,200 vendor relationships. The Vendor Compliance module provides vendors with structured, self-service access to chargeback and violation data—replacing a fragmented, ticket-driven process. Major retail competitors, including Amazon and Walmart, already provide equivalent portal-based data access to their vendor partners.</w:t>
+      </w:r>
+    </w:p>
+    <w:p>
+      <w:r>
+        <w:t>Until now, CPFR has distributed this data through weekly emailed reports—a model designed when the program served roughly 1,000 vendors. At more than three times that scale, the manual process created compounding strain: data freshness was limited to weekly snapshots while vendors and ISMs needed mid-week visibility for responsive decision-making; vendors had no self-service access to current or historical data between report cycles; and all changes to distribution lists required manual coordination through Chewy, creating delays and administrative overhead that scaled with every vendor added. Chargeback disputes followed a similarly manual path, with no vendor-side visibility into dispute status or resolution.</w:t>
+      </w:r>
+    </w:p>
+    <w:p>
+      <w:r>
+        <w:t>The CPFR integration in Chewy Partner Hub addresses these constraints through two complementary components. A governed data platform built in Snowflake by SC-BIE establishes a single source of truth with daily refresh, vendor isolation, immutable snapshots, and data lineage, eliminating the class of cross-system discrepancies entirely. The CPFR module in CPH provides vendors with on-demand access to current and historical data through a secure portal, self-service administration of distribution lists, and a scorecard landing page for at-a-glance business performance—removing Chewy as the manual bottleneck and giving vendors the self-service capability they already experience with other major retail partners. The Vendor Compliance module enables self-service chargeback dispute resolution and integrates compliance metrics into vendor-facing workflows.</w:t>
       </w:r>
     </w:p>
     <w:p>
@@ -187,14 +171,7 @@
           <w:b/>
           <w:bCs/>
         </w:rPr>
-        <w:t>Q</w:t>
-      </w:r>
-      <w:r>
-        <w:rPr>
-          <w:b/>
-          <w:bCs/>
-        </w:rPr>
-        <w:t>: What was the measurable value of the CPFR program, and what was the operational risk of the prior delivery model?</w:t>
+        <w:t>Q: What was the measurable value of the CPFR program, and what was the operational risk of the prior delivery model?</w:t>
       </w:r>
     </w:p>
     <w:p>
@@ -249,10 +226,7 @@
     </w:p>
     <w:p>
       <w:r>
-        <w:t>I</w:t>
-      </w:r>
-      <w:r>
-        <w:t>n January 2026, proprietary inventory and forecast data for Kent Nutrition Group was released to an unrelated vendor due to erroneous distribution list information—contained without further exposure, but illustrating a systemic vulnerability in manual distribution list management that scaled with vendor count.</w:t>
+        <w:t>In January 2026, proprietary inventory and forecast data for Kent Nutrition Group was released to an unrelated vendor due to erroneous distribution list information—contained without further exposure, but illustrating a systemic vulnerability in manual distribution list management that scaled with vendor count.</w:t>
       </w:r>
     </w:p>
     <w:p>
@@ -276,10 +250,19 @@
     </w:p>
     <w:p>
       <w:r>
-        <w:t>The cost-benefit asymmetry was stark. The marginal investment to realize value on a platform already built was bounded to CPH engineering capacity—while the value at risk included $1.4M in projected recurring annual cost avoidance, $15M in annual exposure from recurring threshold issues, and competitive parity with Amazon and Walmart, who already provided equivalent vendor portal access. Progress through allocation de-risked the funding submission by demonstrating delivery momentum and reducing remaining sc</w:t>
-      </w:r>
-      <w:r>
-        <w:t>ope to a well-defined increment.</w:t>
+        <w:t xml:space="preserve">The cost-benefit asymmetry was stark. The marginal investment to realize value on a platform already built was bounded to CPH engineering capacity—while the value at risk included $1.4M in projected recurring annual cost avoidance, $15M in annual exposure from recurring </w:t>
+      </w:r>
+      <w:r>
+        <w:t xml:space="preserve">buy-up </w:t>
+      </w:r>
+      <w:r>
+        <w:t>issues</w:t>
+      </w:r>
+      <w:r>
+        <w:t xml:space="preserve"> triggered by threshold signals in data</w:t>
+      </w:r>
+      <w:r>
+        <w:t>, and competitive parity with Amazon and Walmart, who already provided equivalent vendor portal access. Progress through allocation de-risked the funding submission by demonstrating delivery momentum and reducing remaining scope to a well-defined increment.</w:t>
       </w:r>
     </w:p>
     <w:p>
@@ -293,10 +276,7 @@
     </w:p>
     <w:p>
       <w:r>
-        <w:t>Unified vendor experience was a first-order design constraint for this initiative, not an afterthought. The CPFR module was built within CPH’s existing architecture, using the same navigation patterns, design language, and vendor-authentication framework that underpin all CPH capabilities. Vendor isolation, admin controls, and data governance are enforced at the platform level—not implemented per module. The CPFR and Vendor Compliance workstreams shared a consolidated BRD and were coordinated through a unif</w:t>
-      </w:r>
-      <w:r>
-        <w:t>ied integration plan specifically to prevent the fragmentation that erodes vendor trust when modules feel disconnected. As additional capabilities come online, they inherit this shared foundation.</w:t>
+        <w:t>Unified vendor experience was a first-order design constraint for this initiative, not an afterthought. The CPFR module was built within CPH’s existing architecture, using the same navigation patterns, design language, and vendor-authentication framework that underpin all CPH capabilities. Vendor isolation, admin controls, and data governance are enforced at the platform level—not implemented per module. The CPFR and Vendor Compliance workstreams shared a consolidated BRD and were coordinated through a unified integration plan specifically to prevent the fragmentation that erodes vendor trust when modules feel disconnected. As additional capabilities come online, they inherit this shared foundation.</w:t>
       </w:r>
     </w:p>
     <w:p>
@@ -310,11 +290,11 @@
     </w:p>
     <w:p>
       <w:r>
-        <w:t xml:space="preserve">VDS is a premium analytics service providing broad supply chain intelligence to 65 strategic vendors ($400K entry + 3% of COGS, plus $250K for API access). CPFR provides a narrower dataset—forecast, inventory, and replenishment data—at no </w:t>
+        <w:t xml:space="preserve">VDS is a premium analytics service providing broad supply chain intelligence to 65 strategic vendors ($400K entry + 3% of COGS, plus $250K for API access). CPFR provides a narrower dataset—forecast, inventory, and replenishment data—at no cost to all 3,200+ enrolled vendors. The two serve fundamentally different needs and populations. The CPFR module in CPH </w:t>
       </w:r>
       <w:r>
         <w:lastRenderedPageBreak/>
-        <w:t xml:space="preserve">cost to all 3,200+ enrolled vendors. The two serve fundamentally different needs and populations. The CPFR module in CPH does not replicate VDS; it provides self-service access to the tactical planning data that </w:t>
+        <w:t xml:space="preserve">does not replicate VDS; it provides self-service access to the tactical planning data that </w:t>
       </w:r>
       <w:proofErr w:type="gramStart"/>
       <w:r>
@@ -336,10 +316,7 @@
     </w:p>
     <w:p>
       <w:r>
-        <w:t>Under the prior model, Chewy was the sole handler of vendor distribution lists for CPFR. Every add, delete, or revision to which recipients received which vendor’s proprietary data was a manual process handled by the CPFR team. At 3,200+ vendors, this created persistent exposure to misdirected data. In January 2026, inventory and forecast data for Kent Nutrition Group was released to an unrelated vendor due to erroneous upload information provided through the intake process. The incident was contained witho</w:t>
-      </w:r>
-      <w:r>
-        <w:t>ut further exposure, but the mechanism that allowed it—manual vendor-to-recipient mapping with no vendor-side verification—remained in place for every vendor in the program. The portal addresses this structurally: vendor-managed self-service distribution administration means vendors control their own recipient lists directly, with changes auditable and immediate. Chewy is no longer in the chain of custody for routine distribution management, eliminating the manual error vector.</w:t>
+        <w:t>Under the prior model, Chewy was the sole handler of vendor distribution lists for CPFR. Every add, delete, or revision to which recipients received which vendor’s proprietary data was a manual process handled by the CPFR team. At 3,200+ vendors, this created persistent exposure to misdirected data. In January 2026, inventory and forecast data for Kent Nutrition Group was released to an unrelated vendor due to erroneous upload information provided through the intake process. The incident was contained without further exposure, but the mechanism that allowed it—manual vendor-to-recipient mapping with no vendor-side verification—remained in place for every vendor in the program. The portal addresses this structurally: vendor-managed self-service distribution administration means vendors control their own recipient lists directly, with changes auditable and immediate. Chewy is no longer in the chain of custody for routine distribution management, eliminating the manual error vector.</w:t>
       </w:r>
     </w:p>
     <w:p>
@@ -353,10 +330,7 @@
     </w:p>
     <w:p>
       <w:r>
-        <w:t>Before the CPH integration, chargeback disputes were handled entirely through Oracle CRM tickets—approximately 1,500 annually—with no vendor-side visibility into dispute status, resolution criteria, or compliance history. The Vendor Compliance module provides vendors with structured, self-service access to chargeback data, dispute resolution workflows, and compliance metrics. This reduces manual ticket volume, gives vendors accountability data they can act on proactively, and integrates compliance visibilit</w:t>
-      </w:r>
-      <w:r>
-        <w:t>y into ISM discussion frameworks. The chargeback expansion enabled through the platform represents approximately $10M in annual entitlement opportunity.</w:t>
+        <w:t>Before the CPH integration, chargeback disputes were handled entirely through Oracle CRM tickets—approximately 1,500 annually—with no vendor-side visibility into dispute status, resolution criteria, or compliance history. The Vendor Compliance module provides vendors with structured, self-service access to chargeback data, dispute resolution workflows, and compliance metrics. This reduces manual ticket volume, gives vendors accountability data they can act on proactively, and integrates compliance visibility into ISM discussion frameworks. The chargeback expansion enabled through the platform represents approximately $10M in annual entitlement opportunity.</w:t>
       </w:r>
     </w:p>
     <w:p>
@@ -424,14 +398,7 @@
           <w:b/>
           <w:bCs/>
         </w:rPr>
-        <w:t>Q</w:t>
-      </w:r>
-      <w:r>
-        <w:rPr>
-          <w:b/>
-          <w:bCs/>
-        </w:rPr>
-        <w:t>: What were the primary risks, and what was the cost of inaction?</w:t>
+        <w:t>Q: What were the primary risks, and what was the cost of inaction?</w:t>
       </w:r>
     </w:p>
     <w:p>
@@ -465,13 +432,7 @@
     </w:p>
     <w:p>
       <w:r>
-        <w:t>H</w:t>
-      </w:r>
-      <w:r>
-        <w:t>ad the initiative not proceeded: a completed, governed data platform would have sat unconsumed. The email-based distribution process would have continued to scale manually toward 4,150+ vendors. Data exposure risk would have remained unmitigated. The competitive gap with Amazon and Walmart would have persisted. And the investment in business requirements, user stories, wireframes, and feasibility analysis—work done specifically to de-risk the portal build—would have depreciated as organizational context ero</w:t>
-      </w:r>
-      <w:r>
-        <w:t>ded.</w:t>
+        <w:t>Had the initiative not proceeded: a completed, governed data platform would have sat unconsumed. The email-based distribution process would have continued to scale manually toward 4,150+ vendors. Data exposure risk would have remained unmitigated. The competitive gap with Amazon and Walmart would have persisted. And the investment in business requirements, user stories, wireframes, and feasibility analysis—work done specifically to de-risk the portal build—would have depreciated as organizational context eroded.</w:t>
       </w:r>
     </w:p>
     <w:p/>
@@ -490,14 +451,7 @@
           <w:b/>
           <w:bCs/>
         </w:rPr>
-        <w:t>Q</w:t>
-      </w:r>
-      <w:r>
-        <w:rPr>
-          <w:b/>
-          <w:bCs/>
-        </w:rPr>
-        <w:t>: Will I still receive my weekly CPFR report by email?</w:t>
+        <w:t>Q: Will I still receive my weekly CPFR report by email?</w:t>
       </w:r>
     </w:p>
     <w:p>

</xml_diff>